<commit_message>
ADAP 2023: Add non-anonymized components + implement splitting
</commit_message>
<xml_diff>
--- a/budget/budget_justification_anonymized.docx
+++ b/budget/budget_justification_anonymized.docx
@@ -16,9 +16,9 @@
           <w:szCs w:val="28"/>
         </w:rPr>
       </w:pPr>
-      <w:bookmarkStart w:id="0" w:name="Budget_Justification"/>
-      <w:bookmarkStart w:id="1" w:name="Post%E2%80%93Processing"/>
-      <w:bookmarkStart w:id="2" w:name="Goals_and_Significance"/>
+      <w:bookmarkStart w:id="0" w:name="Goals_and_Significance"/>
+      <w:bookmarkStart w:id="1" w:name="Post%25E2%2580%2593Processing"/>
+      <w:bookmarkStart w:id="2" w:name="Budget_Justification"/>
       <w:bookmarkEnd w:id="0"/>
       <w:bookmarkEnd w:id="1"/>
       <w:bookmarkEnd w:id="2"/>
@@ -218,11 +218,11 @@
         </w:rPr>
         <w:t xml:space="preserve">PI </w:t>
       </w:r>
-      <w:bookmarkStart w:id="5" w:name="Publication_Costs"/>
-      <w:bookmarkStart w:id="6" w:name="Photometry"/>
+      <w:bookmarkStart w:id="5" w:name="Data_Management_Plan"/>
+      <w:bookmarkStart w:id="6" w:name="Supplies"/>
       <w:bookmarkStart w:id="7" w:name="Pipeline_Architecture"/>
-      <w:bookmarkStart w:id="8" w:name="Supplies"/>
-      <w:bookmarkStart w:id="9" w:name="Data_Management_Plan"/>
+      <w:bookmarkStart w:id="8" w:name="Photometry"/>
+      <w:bookmarkStart w:id="9" w:name="Publication_Costs"/>
       <w:bookmarkEnd w:id="5"/>
       <w:bookmarkEnd w:id="6"/>
       <w:bookmarkEnd w:id="7"/>
@@ -291,23 +291,125 @@
         <w:pStyle w:val="TextBody"/>
         <w:spacing w:lineRule="auto" w:line="288" w:before="0" w:after="0"/>
         <w:ind w:left="180" w:right="1580" w:firstLine="360"/>
+        <w:rPr/>
+      </w:pPr>
+      <w:r>
+        <w:rPr>
+          <w:spacing w:val="-4"/>
+          <w:sz w:val="24"/>
+          <w:szCs w:val="24"/>
+        </w:rPr>
+        <w:t>The PI’s</w:t>
+      </w:r>
+      <w:r>
+        <w:rPr>
+          <w:spacing w:val="8"/>
+          <w:sz w:val="24"/>
+          <w:szCs w:val="24"/>
+        </w:rPr>
+        <w:t xml:space="preserve"> </w:t>
+      </w:r>
+      <w:r>
+        <w:rPr>
+          <w:sz w:val="24"/>
+          <w:szCs w:val="24"/>
+        </w:rPr>
+        <w:t>academic</w:t>
+      </w:r>
+      <w:r>
+        <w:rPr>
+          <w:spacing w:val="7"/>
+          <w:sz w:val="24"/>
+          <w:szCs w:val="24"/>
+        </w:rPr>
+        <w:t xml:space="preserve"> </w:t>
+      </w:r>
+      <w:r>
+        <w:rPr>
+          <w:sz w:val="24"/>
+          <w:szCs w:val="24"/>
+        </w:rPr>
+        <w:t>year</w:t>
+      </w:r>
+      <w:r>
+        <w:rPr>
+          <w:spacing w:val="7"/>
+          <w:sz w:val="24"/>
+          <w:szCs w:val="24"/>
+        </w:rPr>
+        <w:t xml:space="preserve"> </w:t>
+      </w:r>
+      <w:r>
+        <w:rPr>
+          <w:sz w:val="24"/>
+          <w:szCs w:val="24"/>
+        </w:rPr>
+        <w:t>salary</w:t>
+      </w:r>
+      <w:r>
+        <w:rPr>
+          <w:spacing w:val="7"/>
+          <w:sz w:val="24"/>
+          <w:szCs w:val="24"/>
+        </w:rPr>
+        <w:t xml:space="preserve"> (9 months) </w:t>
+      </w:r>
+      <w:r>
+        <w:rPr>
+          <w:sz w:val="24"/>
+          <w:szCs w:val="24"/>
+        </w:rPr>
+        <w:t>is</w:t>
+      </w:r>
+      <w:r>
+        <w:rPr>
+          <w:spacing w:val="8"/>
+          <w:sz w:val="24"/>
+          <w:szCs w:val="24"/>
+        </w:rPr>
+        <w:t xml:space="preserve"> </w:t>
+      </w:r>
+      <w:r>
+        <w:rPr>
+          <w:sz w:val="24"/>
+          <w:szCs w:val="24"/>
+        </w:rPr>
+        <w:t>fully</w:t>
+      </w:r>
+      <w:r>
+        <w:rPr>
+          <w:spacing w:val="7"/>
+          <w:sz w:val="24"/>
+          <w:szCs w:val="24"/>
+        </w:rPr>
+        <w:t xml:space="preserve"> </w:t>
+      </w:r>
+      <w:r>
+        <w:rPr>
+          <w:sz w:val="24"/>
+          <w:szCs w:val="24"/>
+        </w:rPr>
+        <w:t>supported</w:t>
+      </w:r>
+      <w:r>
+        <w:rPr>
+          <w:spacing w:val="7"/>
+          <w:sz w:val="24"/>
+          <w:szCs w:val="24"/>
+        </w:rPr>
+        <w:t xml:space="preserve"> </w:t>
+      </w:r>
+      <w:r>
         <w:rPr>
           <w:spacing w:val="-3"/>
           <w:sz w:val="24"/>
           <w:szCs w:val="24"/>
         </w:rPr>
-      </w:pPr>
-      <w:r>
-        <w:rPr>
-          <w:spacing w:val="-4"/>
-          <w:sz w:val="24"/>
-          <w:szCs w:val="24"/>
-        </w:rPr>
-        <w:t>The PI’s</w:t>
-      </w:r>
-      <w:r>
-        <w:rPr>
-          <w:spacing w:val="8"/>
+        <w:t>by</w:t>
+      </w:r>
+      <w:r>
+        <w:rPr>
+          <w:spacing w:val="7"/>
           <w:sz w:val="24"/>
           <w:szCs w:val="24"/>
         </w:rPr>
@@ -318,90 +420,7 @@
           <w:sz w:val="24"/>
           <w:szCs w:val="24"/>
         </w:rPr>
-        <w:t>academic</w:t>
-      </w:r>
-      <w:r>
-        <w:rPr>
-          <w:spacing w:val="7"/>
-          <w:sz w:val="24"/>
-          <w:szCs w:val="24"/>
-        </w:rPr>
-        <w:t xml:space="preserve"> </w:t>
-      </w:r>
-      <w:r>
-        <w:rPr>
-          <w:sz w:val="24"/>
-          <w:szCs w:val="24"/>
-        </w:rPr>
-        <w:t>year</w:t>
-      </w:r>
-      <w:r>
-        <w:rPr>
-          <w:spacing w:val="7"/>
-          <w:sz w:val="24"/>
-          <w:szCs w:val="24"/>
-        </w:rPr>
-        <w:t xml:space="preserve"> </w:t>
-      </w:r>
-      <w:r>
-        <w:rPr>
-          <w:sz w:val="24"/>
-          <w:szCs w:val="24"/>
-        </w:rPr>
-        <w:t>salary</w:t>
-      </w:r>
-      <w:r>
-        <w:rPr>
-          <w:spacing w:val="7"/>
-          <w:sz w:val="24"/>
-          <w:szCs w:val="24"/>
-        </w:rPr>
-        <w:t xml:space="preserve"> (9 months) </w:t>
-      </w:r>
-      <w:r>
-        <w:rPr>
-          <w:sz w:val="24"/>
-          <w:szCs w:val="24"/>
-        </w:rPr>
-        <w:t>is</w:t>
-      </w:r>
-      <w:r>
-        <w:rPr>
-          <w:spacing w:val="8"/>
-          <w:sz w:val="24"/>
-          <w:szCs w:val="24"/>
-        </w:rPr>
-        <w:t xml:space="preserve"> </w:t>
-      </w:r>
-      <w:r>
-        <w:rPr>
-          <w:sz w:val="24"/>
-          <w:szCs w:val="24"/>
-        </w:rPr>
-        <w:t>fully</w:t>
-      </w:r>
-      <w:r>
-        <w:rPr>
-          <w:spacing w:val="7"/>
-          <w:sz w:val="24"/>
-          <w:szCs w:val="24"/>
-        </w:rPr>
-        <w:t xml:space="preserve"> </w:t>
-      </w:r>
-      <w:r>
-        <w:rPr>
-          <w:sz w:val="24"/>
-          <w:szCs w:val="24"/>
-        </w:rPr>
-        <w:t>supported</w:t>
-      </w:r>
-      <w:r>
-        <w:rPr>
-          <w:spacing w:val="7"/>
-          <w:sz w:val="24"/>
-          <w:szCs w:val="24"/>
-        </w:rPr>
-        <w:t xml:space="preserve"> </w:t>
+        <w:t>his institution and an additional summer month of salary is provided for faculty who teach during the Summer term</w:t>
       </w:r>
       <w:r>
         <w:rPr>
@@ -409,256 +428,7 @@
           <w:sz w:val="24"/>
           <w:szCs w:val="24"/>
         </w:rPr>
-        <w:t>by</w:t>
-      </w:r>
-      <w:r>
-        <w:rPr>
-          <w:spacing w:val="7"/>
-          <w:sz w:val="24"/>
-          <w:szCs w:val="24"/>
-        </w:rPr>
-        <w:t xml:space="preserve"> </w:t>
-      </w:r>
-      <w:r>
-        <w:rPr>
-          <w:sz w:val="24"/>
-          <w:szCs w:val="24"/>
-        </w:rPr>
-        <w:t>his institution and an additional summer month of salary is provided for faculty who teach during the Summer term</w:t>
-      </w:r>
-      <w:r>
-        <w:rPr>
-          <w:spacing w:val="-3"/>
-          <w:sz w:val="24"/>
-          <w:szCs w:val="24"/>
-        </w:rPr>
         <w:t>.</w:t>
-      </w:r>
-    </w:p>
-    <w:p>
-      <w:pPr>
-        <w:pStyle w:val="TextBody"/>
-        <w:spacing w:lineRule="auto" w:line="288" w:before="47" w:after="240"/>
-        <w:ind w:left="180" w:right="1580" w:firstLine="360"/>
-        <w:rPr/>
-      </w:pPr>
-      <w:r>
-        <w:rPr>
-          <w:spacing w:val="-3"/>
-          <w:sz w:val="24"/>
-          <w:szCs w:val="24"/>
-        </w:rPr>
-        <w:t>T</w:t>
-      </w:r>
-      <w:r>
-        <w:rPr>
-          <w:spacing w:val="-3"/>
-          <w:sz w:val="24"/>
-          <w:szCs w:val="24"/>
-        </w:rPr>
-        <w:t>he PI of the project will:</w:t>
-      </w:r>
-    </w:p>
-    <w:p>
-      <w:pPr>
-        <w:pStyle w:val="TextBody"/>
-        <w:numPr>
-          <w:ilvl w:val="0"/>
-          <w:numId w:val="3"/>
-        </w:numPr>
-        <w:spacing w:lineRule="auto" w:line="276" w:before="47" w:after="240"/>
-        <w:ind w:left="900" w:right="1580" w:hanging="360"/>
-        <w:rPr>
-          <w:spacing w:val="-3"/>
-          <w:sz w:val="24"/>
-          <w:szCs w:val="24"/>
-        </w:rPr>
-      </w:pPr>
-      <w:r>
-        <w:rPr>
-          <w:spacing w:val="-3"/>
-          <w:sz w:val="24"/>
-          <w:szCs w:val="24"/>
-        </w:rPr>
-        <w:t>Provide the general scientific direction of the project.</w:t>
-      </w:r>
-    </w:p>
-    <w:p>
-      <w:pPr>
-        <w:pStyle w:val="TextBody"/>
-        <w:numPr>
-          <w:ilvl w:val="0"/>
-          <w:numId w:val="3"/>
-        </w:numPr>
-        <w:spacing w:lineRule="auto" w:line="276" w:before="47" w:after="240"/>
-        <w:ind w:left="900" w:right="1580" w:hanging="360"/>
-        <w:rPr>
-          <w:spacing w:val="-3"/>
-          <w:sz w:val="24"/>
-          <w:szCs w:val="24"/>
-        </w:rPr>
-      </w:pPr>
-      <w:r>
-        <w:rPr>
-          <w:spacing w:val="-3"/>
-          <w:sz w:val="24"/>
-          <w:szCs w:val="24"/>
-        </w:rPr>
-        <w:t>Help with collecting and preparing the data required for all analyses listed in the project description.</w:t>
-      </w:r>
-    </w:p>
-    <w:p>
-      <w:pPr>
-        <w:pStyle w:val="TextBody"/>
-        <w:numPr>
-          <w:ilvl w:val="0"/>
-          <w:numId w:val="3"/>
-        </w:numPr>
-        <w:spacing w:lineRule="auto" w:line="276" w:before="47" w:after="240"/>
-        <w:ind w:left="900" w:right="1580" w:hanging="360"/>
-        <w:rPr>
-          <w:spacing w:val="-3"/>
-          <w:sz w:val="24"/>
-          <w:szCs w:val="24"/>
-        </w:rPr>
-      </w:pPr>
-      <w:r>
-        <w:rPr>
-          <w:spacing w:val="-3"/>
-          <w:sz w:val="24"/>
-          <w:szCs w:val="24"/>
-        </w:rPr>
-        <w:t>Oversee the software development effort: coordination, and integration of team member contributions.</w:t>
-      </w:r>
-    </w:p>
-    <w:p>
-      <w:pPr>
-        <w:pStyle w:val="TextBody"/>
-        <w:numPr>
-          <w:ilvl w:val="0"/>
-          <w:numId w:val="3"/>
-        </w:numPr>
-        <w:spacing w:lineRule="auto" w:line="276" w:before="47" w:after="240"/>
-        <w:ind w:left="900" w:right="1580" w:hanging="360"/>
-        <w:rPr>
-          <w:spacing w:val="-3"/>
-          <w:sz w:val="24"/>
-          <w:szCs w:val="24"/>
-        </w:rPr>
-      </w:pPr>
-      <w:r>
-        <w:rPr>
-          <w:spacing w:val="-3"/>
-          <w:sz w:val="24"/>
-          <w:szCs w:val="24"/>
-        </w:rPr>
-        <w:t>Be an active developer in the software effort.</w:t>
-      </w:r>
-    </w:p>
-    <w:p>
-      <w:pPr>
-        <w:pStyle w:val="TextBody"/>
-        <w:numPr>
-          <w:ilvl w:val="0"/>
-          <w:numId w:val="3"/>
-        </w:numPr>
-        <w:spacing w:lineRule="auto" w:line="276" w:before="47" w:after="240"/>
-        <w:ind w:left="900" w:right="1580" w:hanging="360"/>
-        <w:rPr>
-          <w:spacing w:val="-3"/>
-          <w:sz w:val="24"/>
-          <w:szCs w:val="24"/>
-        </w:rPr>
-      </w:pPr>
-      <w:r>
-        <w:rPr>
-          <w:spacing w:val="-3"/>
-          <w:sz w:val="24"/>
-          <w:szCs w:val="24"/>
-        </w:rPr>
-        <w:t>Participate in the manual vetting and review as described in the Science/Technical/Management section.</w:t>
-      </w:r>
-    </w:p>
-    <w:p>
-      <w:pPr>
-        <w:pStyle w:val="TextBody"/>
-        <w:numPr>
-          <w:ilvl w:val="0"/>
-          <w:numId w:val="3"/>
-        </w:numPr>
-        <w:spacing w:lineRule="auto" w:line="276" w:before="47" w:after="240"/>
-        <w:ind w:left="900" w:right="1580" w:hanging="360"/>
-        <w:rPr>
-          <w:spacing w:val="-3"/>
-          <w:sz w:val="24"/>
-          <w:szCs w:val="24"/>
-        </w:rPr>
-      </w:pPr>
-      <w:r>
-        <w:rPr>
-          <w:spacing w:val="-3"/>
-          <w:sz w:val="24"/>
-          <w:szCs w:val="24"/>
-        </w:rPr>
-        <w:t>Request and oversee computing and storage allocation at resources available through the PI’s institution.</w:t>
-      </w:r>
-    </w:p>
-    <w:p>
-      <w:pPr>
-        <w:pStyle w:val="TextBody"/>
-        <w:numPr>
-          <w:ilvl w:val="0"/>
-          <w:numId w:val="3"/>
-        </w:numPr>
-        <w:spacing w:lineRule="auto" w:line="276" w:before="47" w:after="240"/>
-        <w:ind w:left="900" w:right="1580" w:hanging="360"/>
-        <w:rPr/>
-      </w:pPr>
-      <w:r>
-        <w:rPr>
-          <w:spacing w:val="-3"/>
-          <w:sz w:val="24"/>
-          <w:szCs w:val="24"/>
-        </w:rPr>
-        <w:t>Lead two of the publications and help with the preparation of the others.</w:t>
-      </w:r>
-    </w:p>
-    <w:p>
-      <w:pPr>
-        <w:pStyle w:val="TextBody"/>
-        <w:spacing w:lineRule="auto" w:line="276" w:before="47" w:after="240"/>
-        <w:ind w:left="900" w:right="1580" w:hanging="0"/>
-        <w:rPr>
-          <w:spacing w:val="-3"/>
-          <w:sz w:val="24"/>
-          <w:szCs w:val="24"/>
-        </w:rPr>
-      </w:pPr>
-      <w:r>
-        <w:rPr>
-          <w:spacing w:val="-3"/>
-          <w:sz w:val="24"/>
-          <w:szCs w:val="24"/>
-        </w:rPr>
-      </w:r>
-    </w:p>
-    <w:p>
-      <w:pPr>
-        <w:pStyle w:val="TextBody"/>
-        <w:spacing w:lineRule="auto" w:line="276" w:before="47" w:after="240"/>
-        <w:ind w:right="1580" w:hanging="0"/>
-        <w:rPr>
-          <w:spacing w:val="-3"/>
-          <w:sz w:val="24"/>
-          <w:szCs w:val="24"/>
-        </w:rPr>
-      </w:pPr>
-      <w:r>
-        <w:rPr>
-          <w:spacing w:val="-3"/>
-          <w:sz w:val="24"/>
-          <w:szCs w:val="24"/>
-        </w:rPr>
       </w:r>
     </w:p>
     <w:p>
@@ -733,21 +503,7 @@
           <w:sz w:val="24"/>
           <w:szCs w:val="24"/>
         </w:rPr>
-        <w:t xml:space="preserve">group and contributed significantnly in the preparation of this proposal. </w:t>
-      </w:r>
-      <w:r>
-        <w:rPr>
-          <w:sz w:val="24"/>
-          <w:szCs w:val="24"/>
-        </w:rPr>
-        <w:t>The student</w:t>
-      </w:r>
-      <w:r>
-        <w:rPr>
-          <w:sz w:val="24"/>
-          <w:szCs w:val="24"/>
-        </w:rPr>
-        <w:t xml:space="preserve"> will be lead authors on at least two of the publications produced and a significant contributor on the other two.</w:t>
+        <w:t>group and contributed significantnly in the preparation of this proposal. The student will be lead authors on at least two of the publications produced and a significant contributor on the other two.</w:t>
       </w:r>
       <w:bookmarkStart w:id="10" w:name="High_Precision_Photometry_Even_With_Larg"/>
       <w:bookmarkEnd w:id="10"/>
@@ -972,10 +728,7 @@
         <w:pStyle w:val="TextBody"/>
         <w:spacing w:lineRule="auto" w:line="271" w:before="47" w:after="240"/>
         <w:ind w:left="180" w:right="1580" w:firstLine="360"/>
-        <w:rPr>
-          <w:sz w:val="24"/>
-          <w:szCs w:val="24"/>
-        </w:rPr>
+        <w:rPr/>
       </w:pPr>
       <w:r>
         <w:rPr>
@@ -1002,10 +755,18 @@
       </w:r>
       <w:r>
         <w:rPr>
-          <w:sz w:val="24"/>
-          <w:szCs w:val="24"/>
-        </w:rPr>
-        <w:t xml:space="preserve">five publications to be produced </w:t>
+          <w:spacing w:val="-3"/>
+          <w:sz w:val="24"/>
+          <w:szCs w:val="24"/>
+        </w:rPr>
+        <w:t>four</w:t>
+      </w:r>
+      <w:r>
+        <w:rPr>
+          <w:sz w:val="24"/>
+          <w:szCs w:val="24"/>
+        </w:rPr>
+        <w:t xml:space="preserve"> publications to be produced </w:t>
       </w:r>
       <w:r>
         <w:rPr>
@@ -1339,7 +1100,7 @@
   <w:p>
     <w:pPr>
       <w:pStyle w:val="TextBody"/>
-      <w:spacing w:lineRule="auto" w:line="12" w:before="0" w:after="0"/>
+      <w:spacing w:lineRule="auto" w:line="9" w:before="0" w:after="0"/>
       <w:ind w:left="0" w:right="0" w:hanging="0"/>
       <w:jc w:val="left"/>
       <w:rPr>
@@ -1394,6 +1155,7 @@
       </w:pPr>
       <w:rPr>
         <w:rFonts w:ascii="Symbol" w:hAnsi="Symbol" w:cs="Symbol" w:hint="default"/>
+        <w:rFonts w:cs="Symbol"/>
       </w:rPr>
     </w:lvl>
     <w:lvl w:ilvl="3">
@@ -1406,6 +1168,7 @@
       </w:pPr>
       <w:rPr>
         <w:rFonts w:ascii="Symbol" w:hAnsi="Symbol" w:cs="Symbol" w:hint="default"/>
+        <w:rFonts w:cs="Symbol"/>
       </w:rPr>
     </w:lvl>
     <w:lvl w:ilvl="4">
@@ -1418,6 +1181,7 @@
       </w:pPr>
       <w:rPr>
         <w:rFonts w:ascii="Symbol" w:hAnsi="Symbol" w:cs="Symbol" w:hint="default"/>
+        <w:rFonts w:cs="Symbol"/>
       </w:rPr>
     </w:lvl>
     <w:lvl w:ilvl="5">
@@ -1430,6 +1194,7 @@
       </w:pPr>
       <w:rPr>
         <w:rFonts w:ascii="Symbol" w:hAnsi="Symbol" w:cs="Symbol" w:hint="default"/>
+        <w:rFonts w:cs="Symbol"/>
       </w:rPr>
     </w:lvl>
     <w:lvl w:ilvl="6">
@@ -1442,6 +1207,7 @@
       </w:pPr>
       <w:rPr>
         <w:rFonts w:ascii="Symbol" w:hAnsi="Symbol" w:cs="Symbol" w:hint="default"/>
+        <w:rFonts w:cs="Symbol"/>
       </w:rPr>
     </w:lvl>
     <w:lvl w:ilvl="7">
@@ -1454,6 +1220,7 @@
       </w:pPr>
       <w:rPr>
         <w:rFonts w:ascii="Symbol" w:hAnsi="Symbol" w:cs="Symbol" w:hint="default"/>
+        <w:rFonts w:cs="Symbol"/>
       </w:rPr>
     </w:lvl>
     <w:lvl w:ilvl="8">
@@ -1466,6 +1233,7 @@
       </w:pPr>
       <w:rPr>
         <w:rFonts w:ascii="Symbol" w:hAnsi="Symbol" w:cs="Symbol" w:hint="default"/>
+        <w:rFonts w:cs="Symbol"/>
       </w:rPr>
     </w:lvl>
   </w:abstractNum>
@@ -1547,6 +1315,7 @@
       </w:pPr>
       <w:rPr>
         <w:rFonts w:ascii="Symbol" w:hAnsi="Symbol" w:cs="Symbol" w:hint="default"/>
+        <w:rFonts w:cs="Symbol"/>
       </w:rPr>
     </w:lvl>
     <w:lvl w:ilvl="5">
@@ -1559,6 +1328,7 @@
       </w:pPr>
       <w:rPr>
         <w:rFonts w:ascii="Symbol" w:hAnsi="Symbol" w:cs="Symbol" w:hint="default"/>
+        <w:rFonts w:cs="Symbol"/>
       </w:rPr>
     </w:lvl>
     <w:lvl w:ilvl="6">
@@ -1571,6 +1341,7 @@
       </w:pPr>
       <w:rPr>
         <w:rFonts w:ascii="Symbol" w:hAnsi="Symbol" w:cs="Symbol" w:hint="default"/>
+        <w:rFonts w:cs="Symbol"/>
       </w:rPr>
     </w:lvl>
     <w:lvl w:ilvl="7">
@@ -1583,6 +1354,7 @@
       </w:pPr>
       <w:rPr>
         <w:rFonts w:ascii="Symbol" w:hAnsi="Symbol" w:cs="Symbol" w:hint="default"/>
+        <w:rFonts w:cs="Symbol"/>
       </w:rPr>
     </w:lvl>
     <w:lvl w:ilvl="8">
@@ -1595,117 +1367,11 @@
       </w:pPr>
       <w:rPr>
         <w:rFonts w:ascii="Symbol" w:hAnsi="Symbol" w:cs="Symbol" w:hint="default"/>
+        <w:rFonts w:cs="Symbol"/>
       </w:rPr>
     </w:lvl>
   </w:abstractNum>
   <w:abstractNum w:abstractNumId="3">
-    <w:lvl w:ilvl="0">
-      <w:start w:val="1"/>
-      <w:numFmt w:val="decimal"/>
-      <w:lvlText w:val="%1."/>
-      <w:lvlJc w:val="left"/>
-      <w:pPr>
-        <w:ind w:left="1188" w:hanging="360"/>
-      </w:pPr>
-    </w:lvl>
-    <w:lvl w:ilvl="1">
-      <w:start w:val="1"/>
-      <w:numFmt w:val="bullet"/>
-      <w:lvlText w:val="o"/>
-      <w:lvlJc w:val="left"/>
-      <w:pPr>
-        <w:ind w:left="1908" w:hanging="360"/>
-      </w:pPr>
-      <w:rPr>
-        <w:rFonts w:ascii="Courier New" w:hAnsi="Courier New" w:cs="Courier New" w:hint="default"/>
-      </w:rPr>
-    </w:lvl>
-    <w:lvl w:ilvl="2">
-      <w:start w:val="1"/>
-      <w:numFmt w:val="bullet"/>
-      <w:lvlText w:val=""/>
-      <w:lvlJc w:val="left"/>
-      <w:pPr>
-        <w:ind w:left="2628" w:hanging="360"/>
-      </w:pPr>
-      <w:rPr>
-        <w:rFonts w:ascii="Wingdings" w:hAnsi="Wingdings" w:cs="Wingdings" w:hint="default"/>
-      </w:rPr>
-    </w:lvl>
-    <w:lvl w:ilvl="3">
-      <w:start w:val="1"/>
-      <w:numFmt w:val="bullet"/>
-      <w:lvlText w:val=""/>
-      <w:lvlJc w:val="left"/>
-      <w:pPr>
-        <w:ind w:left="3348" w:hanging="360"/>
-      </w:pPr>
-      <w:rPr>
-        <w:rFonts w:ascii="Symbol" w:hAnsi="Symbol" w:cs="Symbol" w:hint="default"/>
-      </w:rPr>
-    </w:lvl>
-    <w:lvl w:ilvl="4">
-      <w:start w:val="1"/>
-      <w:numFmt w:val="bullet"/>
-      <w:lvlText w:val="o"/>
-      <w:lvlJc w:val="left"/>
-      <w:pPr>
-        <w:ind w:left="4068" w:hanging="360"/>
-      </w:pPr>
-      <w:rPr>
-        <w:rFonts w:ascii="Courier New" w:hAnsi="Courier New" w:cs="Courier New" w:hint="default"/>
-      </w:rPr>
-    </w:lvl>
-    <w:lvl w:ilvl="5">
-      <w:start w:val="1"/>
-      <w:numFmt w:val="bullet"/>
-      <w:lvlText w:val=""/>
-      <w:lvlJc w:val="left"/>
-      <w:pPr>
-        <w:ind w:left="4788" w:hanging="360"/>
-      </w:pPr>
-      <w:rPr>
-        <w:rFonts w:ascii="Wingdings" w:hAnsi="Wingdings" w:cs="Wingdings" w:hint="default"/>
-      </w:rPr>
-    </w:lvl>
-    <w:lvl w:ilvl="6">
-      <w:start w:val="1"/>
-      <w:numFmt w:val="bullet"/>
-      <w:lvlText w:val=""/>
-      <w:lvlJc w:val="left"/>
-      <w:pPr>
-        <w:ind w:left="5508" w:hanging="360"/>
-      </w:pPr>
-      <w:rPr>
-        <w:rFonts w:ascii="Symbol" w:hAnsi="Symbol" w:cs="Symbol" w:hint="default"/>
-      </w:rPr>
-    </w:lvl>
-    <w:lvl w:ilvl="7">
-      <w:start w:val="1"/>
-      <w:numFmt w:val="bullet"/>
-      <w:lvlText w:val="o"/>
-      <w:lvlJc w:val="left"/>
-      <w:pPr>
-        <w:ind w:left="6228" w:hanging="360"/>
-      </w:pPr>
-      <w:rPr>
-        <w:rFonts w:ascii="Courier New" w:hAnsi="Courier New" w:cs="Courier New" w:hint="default"/>
-      </w:rPr>
-    </w:lvl>
-    <w:lvl w:ilvl="8">
-      <w:start w:val="1"/>
-      <w:numFmt w:val="bullet"/>
-      <w:lvlText w:val=""/>
-      <w:lvlJc w:val="left"/>
-      <w:pPr>
-        <w:ind w:left="6948" w:hanging="360"/>
-      </w:pPr>
-      <w:rPr>
-        <w:rFonts w:ascii="Wingdings" w:hAnsi="Wingdings" w:cs="Wingdings" w:hint="default"/>
-      </w:rPr>
-    </w:lvl>
-  </w:abstractNum>
-  <w:abstractNum w:abstractNumId="4">
     <w:lvl w:ilvl="0">
       <w:start w:val="1"/>
       <w:numFmt w:val="none"/>
@@ -1806,9 +1472,6 @@
   <w:num w:numId="3">
     <w:abstractNumId w:val="3"/>
   </w:num>
-  <w:num w:numId="4">
-    <w:abstractNumId w:val="4"/>
-  </w:num>
 </w:numbering>
 </file>
 
@@ -1818,7 +1481,6 @@
     <w:rPrDefault>
       <w:rPr>
         <w:rFonts w:ascii="Calibri" w:hAnsi="Calibri" w:eastAsia="Calibri" w:cs="" w:asciiTheme="minorHAnsi" w:cstheme="minorBidi" w:eastAsiaTheme="minorHAnsi" w:hAnsiTheme="minorHAnsi"/>
-        <w:sz w:val="22"/>
         <w:szCs w:val="22"/>
         <w:lang w:val="en-US" w:eastAsia="en-US" w:bidi="ar-SA"/>
       </w:rPr>
@@ -2578,6 +2240,204 @@
       <w:rFonts w:cs="Courier New"/>
     </w:rPr>
   </w:style>
+  <w:style w:type="character" w:styleId="ListLabel28">
+    <w:name w:val="ListLabel 28"/>
+    <w:qFormat/>
+    <w:rPr>
+      <w:rFonts w:eastAsia="Arial" w:cs="Arial"/>
+      <w:b/>
+      <w:bCs/>
+      <w:w w:val="102"/>
+      <w:sz w:val="21"/>
+      <w:szCs w:val="21"/>
+    </w:rPr>
+  </w:style>
+  <w:style w:type="character" w:styleId="ListLabel29">
+    <w:name w:val="ListLabel 29"/>
+    <w:qFormat/>
+    <w:rPr>
+      <w:rFonts w:cs="Symbol"/>
+    </w:rPr>
+  </w:style>
+  <w:style w:type="character" w:styleId="ListLabel30">
+    <w:name w:val="ListLabel 30"/>
+    <w:qFormat/>
+    <w:rPr>
+      <w:rFonts w:cs="Symbol"/>
+    </w:rPr>
+  </w:style>
+  <w:style w:type="character" w:styleId="ListLabel31">
+    <w:name w:val="ListLabel 31"/>
+    <w:qFormat/>
+    <w:rPr>
+      <w:rFonts w:cs="Symbol"/>
+    </w:rPr>
+  </w:style>
+  <w:style w:type="character" w:styleId="ListLabel32">
+    <w:name w:val="ListLabel 32"/>
+    <w:qFormat/>
+    <w:rPr>
+      <w:rFonts w:cs="Symbol"/>
+    </w:rPr>
+  </w:style>
+  <w:style w:type="character" w:styleId="ListLabel33">
+    <w:name w:val="ListLabel 33"/>
+    <w:qFormat/>
+    <w:rPr>
+      <w:rFonts w:cs="Symbol"/>
+    </w:rPr>
+  </w:style>
+  <w:style w:type="character" w:styleId="ListLabel34">
+    <w:name w:val="ListLabel 34"/>
+    <w:qFormat/>
+    <w:rPr>
+      <w:rFonts w:cs="Symbol"/>
+    </w:rPr>
+  </w:style>
+  <w:style w:type="character" w:styleId="ListLabel35">
+    <w:name w:val="ListLabel 35"/>
+    <w:qFormat/>
+    <w:rPr>
+      <w:rFonts w:cs="Symbol"/>
+    </w:rPr>
+  </w:style>
+  <w:style w:type="character" w:styleId="ListLabel36">
+    <w:name w:val="ListLabel 36"/>
+    <w:qFormat/>
+    <w:rPr>
+      <w:rFonts w:eastAsia="Arial" w:cs="Arial"/>
+      <w:b/>
+      <w:bCs/>
+      <w:w w:val="102"/>
+      <w:sz w:val="24"/>
+      <w:szCs w:val="24"/>
+    </w:rPr>
+  </w:style>
+  <w:style w:type="character" w:styleId="ListLabel37">
+    <w:name w:val="ListLabel 37"/>
+    <w:qFormat/>
+    <w:rPr>
+      <w:rFonts w:eastAsia="Arial" w:cs="Arial"/>
+      <w:b/>
+      <w:bCs/>
+      <w:w w:val="102"/>
+      <w:sz w:val="24"/>
+      <w:szCs w:val="24"/>
+    </w:rPr>
+  </w:style>
+  <w:style w:type="character" w:styleId="ListLabel38">
+    <w:name w:val="ListLabel 38"/>
+    <w:qFormat/>
+    <w:rPr>
+      <w:rFonts w:eastAsia="Arial" w:cs="Arial"/>
+      <w:b/>
+      <w:bCs/>
+      <w:w w:val="102"/>
+      <w:sz w:val="24"/>
+      <w:szCs w:val="21"/>
+    </w:rPr>
+  </w:style>
+  <w:style w:type="character" w:styleId="ListLabel39">
+    <w:name w:val="ListLabel 39"/>
+    <w:qFormat/>
+    <w:rPr>
+      <w:rFonts w:cs="Arial"/>
+      <w:w w:val="99"/>
+      <w:sz w:val="24"/>
+      <w:szCs w:val="24"/>
+    </w:rPr>
+  </w:style>
+  <w:style w:type="character" w:styleId="ListLabel40">
+    <w:name w:val="ListLabel 40"/>
+    <w:qFormat/>
+    <w:rPr>
+      <w:rFonts w:cs="Symbol"/>
+    </w:rPr>
+  </w:style>
+  <w:style w:type="character" w:styleId="ListLabel41">
+    <w:name w:val="ListLabel 41"/>
+    <w:qFormat/>
+    <w:rPr>
+      <w:rFonts w:cs="Symbol"/>
+    </w:rPr>
+  </w:style>
+  <w:style w:type="character" w:styleId="ListLabel42">
+    <w:name w:val="ListLabel 42"/>
+    <w:qFormat/>
+    <w:rPr>
+      <w:rFonts w:cs="Symbol"/>
+    </w:rPr>
+  </w:style>
+  <w:style w:type="character" w:styleId="ListLabel43">
+    <w:name w:val="ListLabel 43"/>
+    <w:qFormat/>
+    <w:rPr>
+      <w:rFonts w:cs="Symbol"/>
+    </w:rPr>
+  </w:style>
+  <w:style w:type="character" w:styleId="ListLabel44">
+    <w:name w:val="ListLabel 44"/>
+    <w:qFormat/>
+    <w:rPr>
+      <w:rFonts w:cs="Symbol"/>
+    </w:rPr>
+  </w:style>
+  <w:style w:type="character" w:styleId="ListLabel45">
+    <w:name w:val="ListLabel 45"/>
+    <w:qFormat/>
+    <w:rPr>
+      <w:rFonts w:cs="Courier New"/>
+    </w:rPr>
+  </w:style>
+  <w:style w:type="character" w:styleId="ListLabel46">
+    <w:name w:val="ListLabel 46"/>
+    <w:qFormat/>
+    <w:rPr>
+      <w:rFonts w:cs="Wingdings"/>
+    </w:rPr>
+  </w:style>
+  <w:style w:type="character" w:styleId="ListLabel47">
+    <w:name w:val="ListLabel 47"/>
+    <w:qFormat/>
+    <w:rPr>
+      <w:rFonts w:cs="Symbol"/>
+    </w:rPr>
+  </w:style>
+  <w:style w:type="character" w:styleId="ListLabel48">
+    <w:name w:val="ListLabel 48"/>
+    <w:qFormat/>
+    <w:rPr>
+      <w:rFonts w:cs="Courier New"/>
+    </w:rPr>
+  </w:style>
+  <w:style w:type="character" w:styleId="ListLabel49">
+    <w:name w:val="ListLabel 49"/>
+    <w:qFormat/>
+    <w:rPr>
+      <w:rFonts w:cs="Wingdings"/>
+    </w:rPr>
+  </w:style>
+  <w:style w:type="character" w:styleId="ListLabel50">
+    <w:name w:val="ListLabel 50"/>
+    <w:qFormat/>
+    <w:rPr>
+      <w:rFonts w:cs="Symbol"/>
+    </w:rPr>
+  </w:style>
+  <w:style w:type="character" w:styleId="ListLabel51">
+    <w:name w:val="ListLabel 51"/>
+    <w:qFormat/>
+    <w:rPr>
+      <w:rFonts w:cs="Courier New"/>
+    </w:rPr>
+  </w:style>
+  <w:style w:type="character" w:styleId="ListLabel52">
+    <w:name w:val="ListLabel 52"/>
+    <w:qFormat/>
+    <w:rPr>
+      <w:rFonts w:cs="Wingdings"/>
+    </w:rPr>
+  </w:style>
   <w:style w:type="paragraph" w:styleId="Heading">
     <w:name w:val="Heading"/>
     <w:basedOn w:val="Normal"/>

</xml_diff>